<commit_message>
Add complete 27-table ER diagram to database specification
</commit_message>
<xml_diff>
--- a/LMS_DATABASE_MODELS_SPECIFICATION.docx
+++ b/LMS_DATABASE_MODELS_SPECIFICATION.docx
@@ -369,7 +369,7 @@
     </w:p>
     <w:p>
       <w:r>
-        <w:t>Figure 1 illustrates the high-level Conceptual and Logical Entity-Relationship (ER) architecture of the Learning Management System. The diagram represents the domain entities, high-level business relationships, and workflow pathways linking the foundation LMS tier, the Concept-to-Mastery Bridge (CMB) state machine, and the security/audit subsystems.</w:t>
+        <w:t>Figure 1 illustrates the complete logical Entity-Relationship architecture of the Learning Management System. The diagram includes every one of the 27 physical tables, every foreign-key connection, each junction table, and the relationship of each entity to the Identity, Course &amp; Material, Assessment, CMB, and Audit domains.</w:t>
       </w:r>
     </w:p>
     <w:p>
@@ -380,7 +380,7 @@
       <w:r>
         <w:drawing>
           <wp:inline xmlns:a="http://schemas.openxmlformats.org/drawingml/2006/main" xmlns:pic="http://schemas.openxmlformats.org/drawingml/2006/picture">
-            <wp:extent cx="6035040" cy="7863840"/>
+            <wp:extent cx="6035040" cy="4610842"/>
             <wp:docPr id="1" name="Picture 1"/>
             <wp:cNvGraphicFramePr>
               <a:graphicFrameLocks noChangeAspect="1"/>
@@ -389,7 +389,7 @@
               <a:graphicData uri="http://schemas.openxmlformats.org/drawingml/2006/picture">
                 <pic:pic>
                   <pic:nvPicPr>
-                    <pic:cNvPr id="0" name="er_diagram.png"/>
+                    <pic:cNvPr id="0" name="complete_er_diagram.png"/>
                     <pic:cNvPicPr/>
                   </pic:nvPicPr>
                   <pic:blipFill>
@@ -401,7 +401,7 @@
                   <pic:spPr>
                     <a:xfrm>
                       <a:off x="0" y="0"/>
-                      <a:ext cx="6035040" cy="7863840"/>
+                      <a:ext cx="6035040" cy="4610842"/>
                     </a:xfrm>
                     <a:prstGeom prst="rect"/>
                   </pic:spPr>
@@ -423,7 +423,7 @@
           <w:color w:val="64748B"/>
           <w:sz w:val="17"/>
         </w:rPr>
-        <w:t>Figure 1: Conceptual &amp; Logical Entity-Relationship (ER) Diagram of the LMS Architecture.</w:t>
+        <w:t>Figure 1: Complete Entity-Relationship Diagram — all 27 LMS tables and all documented foreign-key connections.</w:t>
       </w:r>
     </w:p>
     <w:p>

</xml_diff>

<commit_message>
Increase ER diagram size in database specification
</commit_message>
<xml_diff>
--- a/LMS_DATABASE_MODELS_SPECIFICATION.docx
+++ b/LMS_DATABASE_MODELS_SPECIFICATION.docx
@@ -374,13 +374,23 @@
     </w:p>
     <w:p>
       <w:pPr>
+        <w:sectPr>
+          <w:pgSz w:w="12240" w:h="15840"/>
+          <w:pgMar w:top="1224" w:right="1224" w:bottom="1224" w:left="1224" w:header="720" w:footer="720" w:gutter="0"/>
+          <w:cols w:space="720"/>
+          <w:docGrid w:linePitch="360"/>
+        </w:sectPr>
+      </w:pPr>
+    </w:p>
+    <w:p>
+      <w:pPr>
         <w:spacing w:before="120" w:after="80"/>
         <w:jc w:val="center"/>
       </w:pPr>
       <w:r>
         <w:drawing>
           <wp:inline xmlns:a="http://schemas.openxmlformats.org/drawingml/2006/main" xmlns:pic="http://schemas.openxmlformats.org/drawingml/2006/picture">
-            <wp:extent cx="6035040" cy="4610842"/>
+            <wp:extent cx="8961120" cy="6846401"/>
             <wp:docPr id="1" name="Picture 1"/>
             <wp:cNvGraphicFramePr>
               <a:graphicFrameLocks noChangeAspect="1"/>
@@ -401,7 +411,7 @@
                   <pic:spPr>
                     <a:xfrm>
                       <a:off x="0" y="0"/>
-                      <a:ext cx="6035040" cy="4610842"/>
+                      <a:ext cx="8961120" cy="6846401"/>
                     </a:xfrm>
                     <a:prstGeom prst="rect"/>
                   </pic:spPr>
@@ -427,50 +437,14 @@
       </w:r>
     </w:p>
     <w:p>
-      <w:pPr/>
-      <w:r>
-        <w:t>The logical architecture is partitioned into five distinct functional domains:</w:t>
-      </w:r>
-    </w:p>
-    <w:p>
       <w:pPr>
-        <w:pStyle w:val="ListBullet"/>
+        <w:sectPr>
+          <w:pgSz w:w="15840" w:h="12240" w:orient="landscape"/>
+          <w:pgMar w:top="792" w:right="792" w:bottom="792" w:left="792" w:header="720" w:footer="720" w:gutter="0"/>
+          <w:cols w:space="720"/>
+          <w:docGrid w:linePitch="360"/>
+        </w:sectPr>
       </w:pPr>
-      <w:r>
-        <w:t>1. Identity &amp; Access: Users, system roles, role assignments, and administrator approval events for lecturers.</w:t>
-      </w:r>
-    </w:p>
-    <w:p>
-      <w:pPr>
-        <w:pStyle w:val="ListBullet"/>
-      </w:pPr>
-      <w:r>
-        <w:t>2. Courses &amp; Materials: Courses, enrolments, concepts, prerequisite dependency graphs, documents, and citable sections.</w:t>
-      </w:r>
-    </w:p>
-    <w:p>
-      <w:pPr>
-        <w:pStyle w:val="ListBullet"/>
-      </w:pPr>
-      <w:r>
-        <w:t>3. Assessment Lifecycle: Assignments, position-indexed questions, submissions, and question-level marks.</w:t>
-      </w:r>
-    </w:p>
-    <w:p>
-      <w:pPr>
-        <w:pStyle w:val="ListBullet"/>
-      </w:pPr>
-      <w:r>
-        <w:t>4. Concept-to-Mastery Bridge (CMB): Diagnostic sessions, student responses, candidate explanation hypotheses, interventions, recommended reading passages, and fresh verification items.</w:t>
-      </w:r>
-    </w:p>
-    <w:p>
-      <w:pPr>
-        <w:pStyle w:val="ListBullet"/>
-      </w:pPr>
-      <w:r>
-        <w:t>5. Audit &amp; AI Gateway: Polymorphic user activity logs, external AI Gateway requests, and prompt grounding citations.</w:t>
-      </w:r>
     </w:p>
     <w:p>
       <w:r>

</xml_diff>